<commit_message>
Actualizando 'General' con plantillas Latex y TikZ
</commit_message>
<xml_diff>
--- a/Lab/02-Geometria/Cilindro_Hueco.docx
+++ b/Lab/02-Geometria/Cilindro_Hueco.docx
@@ -16,7 +16,7 @@
         <w:pStyle w:val="FirstParagraph"/>
       </w:pPr>
       <w:r>
-        <w:t xml:space="preserve">Mateo está diseñando un tanque y necesita saber cuánto leche almacenará el cilindro interno pero solamente cuenta con las medidas de las dimensiones que muestra la figura.</w:t>
+        <w:t xml:space="preserve">Valentina quiere calcular la cantidad de pintura que cabe en el cilindro interno pero solamente cuenta con las medidas de las dimensiones que muestra la figura.</w:t>
       </w:r>
     </w:p>
     <w:p>
@@ -71,7 +71,7 @@
         <w:pStyle w:val="BodyText"/>
       </w:pPr>
       <w:r>
-        <w:t xml:space="preserve">¿Qué medida le falta a Mateo para hallar la cantidad deseada?</w:t>
+        <w:t xml:space="preserve">¿Qué medida le falta a Valentina para hallar la cantidad deseada?</w:t>
       </w:r>
     </w:p>
     <w:bookmarkStart w:id="23" w:name="answerlist"/>
@@ -92,7 +92,7 @@
         </w:numPr>
       </w:pPr>
       <w:r>
-        <w:t xml:space="preserve">Altura del cilindro</w:t>
+        <w:t xml:space="preserve">Perímetro del cilindro</w:t>
       </w:r>
     </w:p>
     <w:p>
@@ -104,7 +104,7 @@
         </w:numPr>
       </w:pPr>
       <w:r>
-        <w:t xml:space="preserve">Perímetro del cilindro</w:t>
+        <w:t xml:space="preserve">Altura del cilindro</w:t>
       </w:r>
     </w:p>
     <w:p>
@@ -116,7 +116,7 @@
         </w:numPr>
       </w:pPr>
       <w:r>
-        <w:t xml:space="preserve">Radio externo</w:t>
+        <w:t xml:space="preserve">Diámetro externo</w:t>
       </w:r>
     </w:p>
     <w:p>
@@ -128,7 +128,7 @@
         </w:numPr>
       </w:pPr>
       <w:r>
-        <w:t xml:space="preserve">Diámetro externo</w:t>
+        <w:t xml:space="preserve">Radio externo</w:t>
       </w:r>
     </w:p>
     <w:bookmarkEnd w:id="23"/>
@@ -147,7 +147,7 @@
         <w:pStyle w:val="FirstParagraph"/>
       </w:pPr>
       <w:r>
-        <w:t xml:space="preserve">Para resolver este problema, debemos analizar qué información necesitamos para calcular el volumen del cilindro interno, que determinará la cantidad de leche que puede contener.</w:t>
+        <w:t xml:space="preserve">Para resolver este problema, debemos analizar qué información necesitamos para calcular el volumen del cilindro interno, que determinará la cantidad de pintura que puede contener.</w:t>
       </w:r>
     </w:p>
     <w:p>
@@ -261,13 +261,13 @@
         <w:t xml:space="preserve"> </w:t>
       </w:r>
       <w:r>
-        <w:t xml:space="preserve">- Radio interno = 0.8 m</w:t>
+        <w:t xml:space="preserve">- Radio interno = 1.7 m</w:t>
       </w:r>
       <w:r>
         <w:t xml:space="preserve"> </w:t>
       </w:r>
       <w:r>
-        <w:t xml:space="preserve">- Grosor = 0.3 m (que determina el radio externo = 1.1 m)</w:t>
+        <w:t xml:space="preserve">- Grosor = 0.8 m (que determina el radio externo = 2.5 m)</w:t>
       </w:r>
     </w:p>
     <w:p>
@@ -281,13 +281,13 @@
         <w:t xml:space="preserve"> </w:t>
       </w:r>
       <w:r>
-        <w:t xml:space="preserve">- Radio externo = Radio interno + Grosor = 0.8 + 0.3 = 1.1 m</w:t>
+        <w:t xml:space="preserve">- Radio externo = Radio interno + Grosor = 1.7 + 0.8 = 2.5 m</w:t>
       </w:r>
       <w:r>
         <w:t xml:space="preserve"> </w:t>
       </w:r>
       <w:r>
-        <w:t xml:space="preserve">- Diámetro externo = 2 × Radio externo = 2 × 1.1 = 2.2 m</w:t>
+        <w:t xml:space="preserve">- Diámetro externo = 2 × Radio externo = 2 × 2.5 = 5 m</w:t>
       </w:r>
     </w:p>
     <w:p>
@@ -301,7 +301,7 @@
         <w:t xml:space="preserve"> </w:t>
       </w:r>
       <w:r>
-        <w:t xml:space="preserve">1. El radio interno (ya lo tenemos: 0.8 m)</w:t>
+        <w:t xml:space="preserve">1. El radio interno (ya lo tenemos: 1.7 m)</w:t>
       </w:r>
       <w:r>
         <w:t xml:space="preserve"> </w:t>
@@ -315,7 +315,7 @@
         <w:pStyle w:val="BodyText"/>
       </w:pPr>
       <w:r>
-        <w:t xml:space="preserve">Por lo tanto, a Mateo le falta conocer la altura del cilindro para poder calcular la cantidad de leche que puede contener el cilindro interno.</w:t>
+        <w:t xml:space="preserve">Por lo tanto, a Valentina le falta conocer la altura del cilindro para poder calcular la cantidad de pintura que puede contener el cilindro interno.</w:t>
       </w:r>
     </w:p>
     <w:bookmarkStart w:id="25" w:name="answerlist-1"/>
@@ -336,7 +336,7 @@
         </w:numPr>
       </w:pPr>
       <w:r>
-        <w:t xml:space="preserve">Este es correcto. Para calcular el volumen del cilindro interno necesitamos conocer su altura del cilindro</w:t>
+        <w:t xml:space="preserve">Este es incorrecto. Conocer el perímetro del cilindro no es suficiente para calcular el volumen, ya tenemos esta información o no es necesaria</w:t>
       </w:r>
     </w:p>
     <w:p>
@@ -348,7 +348,7 @@
         </w:numPr>
       </w:pPr>
       <w:r>
-        <w:t xml:space="preserve">Este es incorrecto. Conocer el perímetro del cilindro no es suficiente para calcular el volumen, ya tenemos esta información o no es necesaria</w:t>
+        <w:t xml:space="preserve">Este es correcto. Para calcular el volumen del cilindro interno necesitamos conocer su altura del cilindro</w:t>
       </w:r>
     </w:p>
     <w:p>
@@ -360,7 +360,7 @@
         </w:numPr>
       </w:pPr>
       <w:r>
-        <w:t xml:space="preserve">Este es incorrecto. Conocer la radio externo no es suficiente para calcular el volumen, ya tenemos esta información o no es necesaria</w:t>
+        <w:t xml:space="preserve">Este es incorrecto. Conocer la diámetro externo no es suficiente para calcular el volumen, ya tenemos esta información o no es necesaria</w:t>
       </w:r>
     </w:p>
     <w:p>
@@ -372,7 +372,7 @@
         </w:numPr>
       </w:pPr>
       <w:r>
-        <w:t xml:space="preserve">Este es incorrecto. Conocer el diámetro externo no es suficiente para calcular el volumen, ya tenemos esta información o no es necesaria</w:t>
+        <w:t xml:space="preserve">Este es incorrecto. Conocer el radio externo no es suficiente para calcular el volumen, ya tenemos esta información o no es necesaria</w:t>
       </w:r>
     </w:p>
     <w:bookmarkEnd w:id="25"/>
@@ -403,7 +403,7 @@
         <w:t xml:space="preserve"> </w:t>
       </w:r>
       <w:r>
-        <w:t xml:space="preserve">exsolution: 1000</w:t>
+        <w:t xml:space="preserve">exsolution: 0100</w:t>
       </w:r>
       <w:r>
         <w:t xml:space="preserve"> </w:t>

</xml_diff>

<commit_message>
Generando Medidas de Tendencia Central
</commit_message>
<xml_diff>
--- a/Lab/02-Geometria/Cilindro_Hueco.docx
+++ b/Lab/02-Geometria/Cilindro_Hueco.docx
@@ -16,7 +16,7 @@
         <w:pStyle w:val="FirstParagraph"/>
       </w:pPr>
       <w:r>
-        <w:t xml:space="preserve">Valentina quiere calcular la cantidad de pintura que cabe en el cilindro interno pero solamente cuenta con las medidas de las dimensiones que muestra la figura.</w:t>
+        <w:t xml:space="preserve">Ana está diseñando un tanque y necesita saber cuánto combustible almacenará el cilindro interno pero solamente cuenta con las medidas de las dimensiones que muestra la figura.</w:t>
       </w:r>
     </w:p>
     <w:p>
@@ -26,14 +26,14 @@
       <w:r>
         <w:drawing>
           <wp:inline>
-            <wp:extent cx="5334000" cy="4445000"/>
+            <wp:extent cx="3733800" cy="3111500"/>
             <wp:effectExtent b="0" l="0" r="0" t="0"/>
             <wp:docPr descr="" title="" id="21" name="Picture"/>
             <a:graphic>
               <a:graphicData uri="http://schemas.openxmlformats.org/drawingml/2006/picture">
                 <pic:pic>
                   <pic:nvPicPr>
-                    <pic:cNvPr descr="Cilindro_Hueco_files/figure-docx/unnamed-chunk-2-1.png" id="22" name="Picture"/>
+                    <pic:cNvPr descr="../../../../../../../../tmp/RtmpXqgVU5/cilindro_hueco.png" id="22" name="Picture"/>
                     <pic:cNvPicPr>
                       <a:picLocks noChangeArrowheads="1" noChangeAspect="1"/>
                     </pic:cNvPicPr>
@@ -47,7 +47,7 @@
                   <pic:spPr bwMode="auto">
                     <a:xfrm>
                       <a:off x="0" y="0"/>
-                      <a:ext cx="5334000" cy="4445000"/>
+                      <a:ext cx="3733800" cy="3111500"/>
                     </a:xfrm>
                     <a:prstGeom prst="rect">
                       <a:avLst/>
@@ -71,7 +71,7 @@
         <w:pStyle w:val="BodyText"/>
       </w:pPr>
       <w:r>
-        <w:t xml:space="preserve">¿Qué medida le falta a Valentina para hallar la cantidad deseada?</w:t>
+        <w:t xml:space="preserve">¿Qué medida le falta a Ana para hallar la cantidad deseada?</w:t>
       </w:r>
     </w:p>
     <w:bookmarkStart w:id="23" w:name="answerlist"/>
@@ -92,7 +92,7 @@
         </w:numPr>
       </w:pPr>
       <w:r>
-        <w:t xml:space="preserve">Perímetro del cilindro</w:t>
+        <w:t xml:space="preserve">Radio externo</w:t>
       </w:r>
     </w:p>
     <w:p>
@@ -116,7 +116,7 @@
         </w:numPr>
       </w:pPr>
       <w:r>
-        <w:t xml:space="preserve">Diámetro externo</w:t>
+        <w:t xml:space="preserve">Perímetro del cilindro</w:t>
       </w:r>
     </w:p>
     <w:p>
@@ -128,7 +128,7 @@
         </w:numPr>
       </w:pPr>
       <w:r>
-        <w:t xml:space="preserve">Radio externo</w:t>
+        <w:t xml:space="preserve">Diámetro externo</w:t>
       </w:r>
     </w:p>
     <w:bookmarkEnd w:id="23"/>
@@ -147,7 +147,7 @@
         <w:pStyle w:val="FirstParagraph"/>
       </w:pPr>
       <w:r>
-        <w:t xml:space="preserve">Para resolver este problema, debemos analizar qué información necesitamos para calcular el volumen del cilindro interno, que determinará la cantidad de pintura que puede contener.</w:t>
+        <w:t xml:space="preserve">Para resolver este problema, debemos analizar qué información necesitamos para calcular el volumen del cilindro interno, que determinará la cantidad de combustible que puede contener.</w:t>
       </w:r>
     </w:p>
     <w:p>
@@ -261,13 +261,13 @@
         <w:t xml:space="preserve"> </w:t>
       </w:r>
       <w:r>
-        <w:t xml:space="preserve">- Radio interno = 1.7 m</w:t>
+        <w:t xml:space="preserve">- Radio interno = 2 m</w:t>
       </w:r>
       <w:r>
         <w:t xml:space="preserve"> </w:t>
       </w:r>
       <w:r>
-        <w:t xml:space="preserve">- Grosor = 0.8 m (que determina el radio externo = 2.5 m)</w:t>
+        <w:t xml:space="preserve">- Grosor = 1 m (que determina el radio externo = 3 m)</w:t>
       </w:r>
     </w:p>
     <w:p>
@@ -281,13 +281,13 @@
         <w:t xml:space="preserve"> </w:t>
       </w:r>
       <w:r>
-        <w:t xml:space="preserve">- Radio externo = Radio interno + Grosor = 1.7 + 0.8 = 2.5 m</w:t>
+        <w:t xml:space="preserve">- Radio externo = Radio interno + Grosor = 2 + 1 = 3 m</w:t>
       </w:r>
       <w:r>
         <w:t xml:space="preserve"> </w:t>
       </w:r>
       <w:r>
-        <w:t xml:space="preserve">- Diámetro externo = 2 × Radio externo = 2 × 2.5 = 5 m</w:t>
+        <w:t xml:space="preserve">- Diámetro externo = 2 × Radio externo = 2 × 3 = 6 m</w:t>
       </w:r>
     </w:p>
     <w:p>
@@ -301,7 +301,7 @@
         <w:t xml:space="preserve"> </w:t>
       </w:r>
       <w:r>
-        <w:t xml:space="preserve">1. El radio interno (ya lo tenemos: 1.7 m)</w:t>
+        <w:t xml:space="preserve">1. El radio interno (ya lo tenemos: 2 m)</w:t>
       </w:r>
       <w:r>
         <w:t xml:space="preserve"> </w:t>
@@ -315,7 +315,7 @@
         <w:pStyle w:val="BodyText"/>
       </w:pPr>
       <w:r>
-        <w:t xml:space="preserve">Por lo tanto, a Valentina le falta conocer la altura del cilindro para poder calcular la cantidad de pintura que puede contener el cilindro interno.</w:t>
+        <w:t xml:space="preserve">Por lo tanto, a Ana le falta conocer la altura del cilindro para poder calcular la cantidad de combustible que puede contener el cilindro interno.</w:t>
       </w:r>
     </w:p>
     <w:bookmarkStart w:id="25" w:name="answerlist-1"/>
@@ -336,7 +336,7 @@
         </w:numPr>
       </w:pPr>
       <w:r>
-        <w:t xml:space="preserve">Este es incorrecto. Conocer el perímetro del cilindro no es suficiente para calcular el volumen, ya tenemos esta información o no es necesaria</w:t>
+        <w:t xml:space="preserve">Este es incorrecto. Conocer el radio externo no es suficiente para calcular el volumen, ya tenemos esta información o no es necesaria</w:t>
       </w:r>
     </w:p>
     <w:p>
@@ -360,7 +360,7 @@
         </w:numPr>
       </w:pPr>
       <w:r>
-        <w:t xml:space="preserve">Este es incorrecto. Conocer la diámetro externo no es suficiente para calcular el volumen, ya tenemos esta información o no es necesaria</w:t>
+        <w:t xml:space="preserve">Este es incorrecto. Conocer la perímetro del cilindro no es suficiente para calcular el volumen, ya tenemos esta información o no es necesaria</w:t>
       </w:r>
     </w:p>
     <w:p>
@@ -372,7 +372,7 @@
         </w:numPr>
       </w:pPr>
       <w:r>
-        <w:t xml:space="preserve">Este es incorrecto. Conocer el radio externo no es suficiente para calcular el volumen, ya tenemos esta información o no es necesaria</w:t>
+        <w:t xml:space="preserve">Este es incorrecto. Conocer el diámetro externo no es suficiente para calcular el volumen, ya tenemos esta información o no es necesaria</w:t>
       </w:r>
     </w:p>
     <w:bookmarkEnd w:id="25"/>

</xml_diff>